<commit_message>
update paper for implemented measurements
</commit_message>
<xml_diff>
--- a/docs/paper/umbra-lucrare.docx
+++ b/docs/paper/umbra-lucrare.docx
@@ -4,6 +4,7 @@
   <w:body>
     <w:p>
       <w:pPr>
+        <w:pStyle w:val="Title"/>
         <w:keepNext w:val="0"/>
         <w:spacing w:before="0" w:after="160" w:line="240" w:lineRule="auto"/>
         <w:jc w:val="center"/>
@@ -209,7 +210,7 @@
           <w:i w:val="0"/>
           <w:sz w:val="22"/>
         </w:rPr>
-        <w:t xml:space="preserve"> Catedra de …, [Liceul / Colegiul …], Constanța, județul Constanța</w:t>
+        <w:t xml:space="preserve"> Informatică pentru Viitor (IPV)</w:t>
       </w:r>
     </w:p>
     <w:p>
@@ -225,7 +226,7 @@
           <w:i w:val="0"/>
           <w:sz w:val="22"/>
         </w:rPr>
-        <w:t>Contact: [adresa@email.com]</w:t>
+        <w:t>Contact: radramra@gmail.com</w:t>
       </w:r>
     </w:p>
     <w:p>
@@ -257,7 +258,7 @@
           <w:i w:val="0"/>
           <w:sz w:val="24"/>
         </w:rPr>
-        <w:t>Aplicația noastră, Umbra, recomandă trasee pietonale prin umbra clădirilor, dar umbra poate fi calculată numai pentru clădirile cu înălțime cunoscută. În Constanța, 87,8% dintre cele 51.428 de clădiri din OpenStreetMap nu au nicio informație despre înălțime. Am evaluat setul global GlobalBuildingAtlas și am constatat că subestimează sistematic blocurile înalte: pentru blocurile cu 9–12 etaje rezultă o valoare mediană de 1,36 m pe etaj. Propunem măsurarea înălțimii din lungimea umbrei, după relația h = L · tan e, unde unghiul Soarelui e este calculat de aplicație. Modelul erorilor arată că precizia depinde aproape numai de măsurarea lungimii, iar măsurătorile trebuie făcute cu Soarele jos. Pe contururile reale ale orașului, la 27 octombrie, 85–90% dintre clădiri au un vârf de umbră neobstrucționat de alte clădiri. Metoda poate completa datele lipsă prin măsurători făcute de utilizatori.</w:t>
+        <w:t>Umbra compară trasee pietonale după expunerea geometrică estimată și ocolul acceptat. În instantaneul OSM al Constanței, 87,8% dintre cele 51.428 de clădiri nu au înălțime sau etaje. Am comparat GlobalBuildingAtlas (GBA) cu etichetele OSM: pentru clădirile cu 9–12 etaje, mediana raportului GBA/etaje este 1,36 m, sugerând o subestimare. Am implementat modul «Măsoară clădirea», bazat pe h = L · tan e, cu incertitudine, stocare locală și partajare opțională. Înălțimile confirmate de regulile aplicației intră în calculul umbrelor și traseelor. Modelul erorilor arată dependența de lungimea măsurată și de elevația Soarelui. La trei momente din 27 octombrie, simularea indică 85–90% vârfuri de umbră neblocate de alte clădiri. Rezultatele sunt analize de date și simulări; precizia pe teren și câștigul real pe trasee nu sunt încă validate.</w:t>
       </w:r>
     </w:p>
     <w:p>
@@ -314,7 +315,7 @@
           <w:i w:val="0"/>
           <w:sz w:val="24"/>
         </w:rPr>
-        <w:t>În zilele caniculare, umbra clădirilor face mersul pe jos mai suportabil. Am realizat Umbra, o aplicație mobilă care recomandă trasee pietonale cu mai multă umbră. Un server care rulează pe calculator calculează poziția Soarelui, umbrele și traseele, iar telefonul afișează harta și citește GPS-ul. Sistemul folosește contururile clădirilor și rețeaua de alei din OpenStreetMap (OSM) [1] și ecuațiile NOAA pentru poziția Soarelui [2].</w:t>
+        <w:t>În zilele caniculare, umbra clădirilor face mersul pe jos mai suportabil. Am realizat Umbra, o aplicație mobilă care compară trasee după plecare, destinație, oră și ocolul acceptat. Un server pe calculator calculează Soarele, umbrele și traseele; telefonul afișează harta și ghidează prin GPS. Sistemul folosește contururile clădirilor și rețeaua de alei din OpenStreetMap (OSM) [1] și ecuațiile NOAA pentru poziția Soarelui [2].</w:t>
       </w:r>
     </w:p>
     <w:p>
@@ -346,7 +347,7 @@
           <w:i w:val="0"/>
           <w:sz w:val="24"/>
         </w:rPr>
-        <w:t>Există mai multe seturi globale de înălțimi. GBA raportează erori pătratice medii între 1,5 și 8,9 m, în funcție de continent [3]; 3D-GloBFP raportează între 1,9 și 14,6 m [7]; EUBUCCO armonizează datele europene, dar preia înălțimile din surse naționale sau din OSM [8]. Toate sunt estimate din imagini de satelit sau compilate din alte surse, iar precizia lor variază mult de la o regiune la alta.</w:t>
+        <w:t>Seturi precum GBA [3], 3D-GloBFP [7] și EUBUCCO [8] estimează sau armonizează înălțimi la scară largă. Performanța globală nu stabilește însă precizia locală în Constanța.</w:t>
       </w:r>
     </w:p>
     <w:p>
@@ -362,7 +363,7 @@
           <w:i w:val="0"/>
           <w:sz w:val="24"/>
         </w:rPr>
-        <w:t>Calcularea înălțimii din umbră este cunoscută în teledetecție, unde se aplică imaginilor din satelit [4]. Noi propunem folosirea ei la sol, cu telefonul: aplicația calculează unghiul Soarelui, iar utilizatorul măsoară doar lungimea umbrei. Scopul lucrării este (1) să evaluăm GBA pe clădirile din Constanța, (2) să stabilim, printr-un model al erorilor, în ce condiții metoda umbrei este precisă și (3) să estimăm câte clădiri pot fi măsurate astfel. Ipoteza noastră este că măsurarea umbrei poate fi mai precisă decât GBA pentru blocurile înalte, deoarece eroarea ei depinde aproape numai de lungimea măsurată.</w:t>
+        <w:t>Calcularea înălțimii din umbră este cunoscută în teledetecție [4]. Am integrat-o într-un flux de măsurare cu telefonul. Întrebarea științifică este: cât de precis poate fi estimată înălțimea din umbră și cum alegem momentul măsurării? Evaluăm consistența GBA cu OSM, sensibilitatea la erori și fezabilitatea geometrică. Ipoteza unei precizii mai bune decât GBA la blocuri înalte rămâne de verificat cu referințe independente pe teren.</w:t>
       </w:r>
     </w:p>
     <w:p>
@@ -403,7 +404,7 @@
           <w:i w:val="0"/>
           <w:sz w:val="24"/>
         </w:rPr>
-        <w:t xml:space="preserve"> Interfața este scrisă în TypeScript, cu React Native și Expo, pentru Android și iOS; motorul de calcul rulează pe un server Node.js. Datele pentru Constanța sunt păstrate comprimat în proiect: 50.071 de noduri și 111.552 de muchii ale rețelei pietonale și 51.428 de contururi de clădiri, în coordonate metrice (UTM, EPSG:32635). Umbra arborilor este estimată separat, cu pondere redusă; lucrarea de față se ocupă numai de clădiri. Fiecare clădire are un interval de înălțime: o înălțime etichetată dă un interval îngust, iar numărul de etaje N dă intervalul 2,5·N – 3,5·N + 3 m. Un punct al traseului este considerat umbrit numai dacă raza Soarelui trece sub limita inferioară; între cele două limite rezultatul este „necunoscut”, iar clădirile fără înălțime nu produc umbră. De aceea, fiecare înălțime măsurată transformă porțiuni necunoscute ale traseelor în porțiuni cu rezultat cert.</w:t>
+        <w:t xml:space="preserve"> Interfața este scrisă în TypeScript, cu React Native și Expo, pentru Android și iOS; motorul de calcul rulează pe un server Node.js. Datele pentru Constanța sunt păstrate comprimat în proiect: 50.071 de noduri și 111.552 de muchii ale rețelei pietonale și 51.428 de contururi de clădiri, în coordonate metrice (UTM, EPSG:32635). Umbra arborilor este estimată separat, cu pondere redusă; lucrarea de față se ocupă numai de clădiri. Fiecare clădire are un interval de înălțime: o înălțime etichetată dă un interval îngust, iar numărul de etaje N dă intervalul 2,5·N – 3,5·N + 3 m. Un punct al traseului este considerat umbrit numai dacă raza Soarelui trece sub limita inferioară; între cele două limite rezultatul este „necunoscut”, iar clădirile fără înălțime nu susțin o clasificare sigură. Expunerea este evaluată la momentele parcurgerii. Căutarea compară un set limitat de candidați, fără garanția optimului global.</w:t>
       </w:r>
     </w:p>
     <w:p>
@@ -419,6 +420,31 @@
           <w:i w:val="0"/>
           <w:sz w:val="24"/>
         </w:rPr>
+        <w:t>Măsoară clădirea.</w:t>
+      </w:r>
+      <w:r>
+        <w:rPr>
+          <w:rFonts w:ascii="Times New Roman" w:hAnsi="Times New Roman" w:eastAsia="Times New Roman"/>
+          <w:b w:val="0"/>
+          <w:i w:val="0"/>
+          <w:sz w:val="24"/>
+        </w:rPr>
+        <w:t xml:space="preserve"> Utilizatorul selectează clădirea și un colț al acoperișului pe rigla umbrei. Introduce distanța măsurată cu ruleta/laserul, folosește GPS-ul sau datele unei fotografii verticale din dronă. Aplicația calculează h și incertitudinea la momentul măsurării, verifică terenul și obstacolele declarate și salvează local încercările. Partajarea este opțională; serverul recalculează rezultatul și păstrează măsurătorile în SQLite. O citire cu ruleta/laserul ori din dronă, sau două citiri independente concordante, pot confirma o clădire conform regulilor software. Intervalele confirmate intră în calculul umbrelor și traseelor. Confirmarea software nu este validare fizică.</w:t>
+      </w:r>
+    </w:p>
+    <w:p>
+      <w:pPr>
+        <w:keepNext w:val="0"/>
+        <w:spacing w:before="0" w:after="120" w:line="276" w:lineRule="auto"/>
+        <w:jc w:val="both"/>
+      </w:pPr>
+      <w:r>
+        <w:rPr>
+          <w:rFonts w:ascii="Times New Roman" w:hAnsi="Times New Roman" w:eastAsia="Times New Roman"/>
+          <w:b/>
+          <w:i w:val="0"/>
+          <w:sz w:val="24"/>
+        </w:rPr>
         <w:t>Date.</w:t>
       </w:r>
       <w:r>
@@ -428,7 +454,7 @@
           <w:i w:val="0"/>
           <w:sz w:val="24"/>
         </w:rPr>
-        <w:t xml:space="preserve"> Am folosit extrasul OSM din 25.10.2026 inclus în aplicație [1] și fișierul GBA pentru regiunea 25–30° E, 40–45° N [3]. GBA folosește identificatorii OSM ai clădirilor, așa că am asociat clădirile direct, după identificator: 40.658 de clădiri (79,1%) au o înălțime GBA. Ca referință am folosit înălțimile din OSM (88 de clădiri asociate) și numărul de etaje (4.925 de clădiri). Analizele sunt scrise în Python și pot fi repetate cu scripturile din proiect.</w:t>
+        <w:t xml:space="preserve"> Am folosit extrasul OSM din 25.10.2026 inclus în aplicație [1] și fișierul GBA pentru regiunea 25–30° E, 40–45° N [3]. GBA folosește identificatorii OSM ai clădirilor, așa că am asociat clădirile direct, după identificator: 40.658 de clădiri (79,1%) au o înălțime GBA. Ca surse de comparație, fără verificare pe teren, am folosit înălțimile OSM (88 de clădiri asociate) și numărul de etaje (4.925 de clădiri). Analizele sunt scrise în Python și pot fi repetate cu scripturile din proiect.</w:t>
       </w:r>
     </w:p>
     <w:p>
@@ -535,7 +561,7 @@
           <w:i w:val="0"/>
           <w:sz w:val="24"/>
         </w:rPr>
-        <w:t xml:space="preserve"> Prin diferențierea relației obținem δh = tan e · δL + L · δe / cos²e. Testele aplicației limitează diferența față de algoritmul SPA la 0,03°; împreună cu refracția atmosferică, nemodelată (circa 0,035° la 25°), aceasta adaugă cel mult aproximativ 0,3% la eroarea înălțimii. Practic, întreaga eroare provine din măsurarea lungimii: fiecare metru greșit în L produce tan e metri de eroare în h. Marginea umbrei nu este netă, deoarece discul Soarelui are 0,53°; lățimea zonei de penumbră este aproximativ h · 0,0093 / sin²e. Am considerat două metode de măsurare a lungimii: poziția GPS a telefonului în vârful umbrei (eroare presupusă ±5 m) și ruleta sau telemetrul laser (eroare presupusă ±0,3 m). Aceste valori trebuie verificate pe teren.</w:t>
+        <w:t xml:space="preserve"> Pentru variații mici, dh = tan e · dL + L · de / cos²e, cu de în radiani. Tabelul 2 izolează termenul lungimii: δh ≈ tan e · δL, presupunând δL = ±5 m pentru GPS și ±0,3 m pentru ruletă/telemetru. Sunt ipoteze, nu precizii măsurate. Implementarea combină în cuadratură termenii lungimii și unghiului, cu σe = 0,065°, și include citirea penumbrei: w ≈ h · 0,0093 / sin²e și σL = √(σinstrument² + w²/12). Pentru GPS folosește și acuratețea raportată de telefon. Testele numerice față de SPA [6] nu validează senzorii sau scena reală.</w:t>
       </w:r>
     </w:p>
     <w:p>
@@ -560,7 +586,7 @@
           <w:i w:val="0"/>
           <w:sz w:val="24"/>
         </w:rPr>
-        <w:t xml:space="preserve"> Vârful umbrei poate cădea pe o altă clădire sau în umbra ei. Am considerat o clădire măsurabilă dacă vârful umbrei unuia dintre colțuri se află pe marginea propriei umbre, linia de la colț la vârf nu traversează altă clădire, iar vârful nu cade pe altă clădire sau în umbra ei. Am analizat 38.913 de clădiri, cu înălțimea din OSM, 3 m pe etaj sau, în lipsă, din GBA, la șase momente (ora României), cu poziția Soarelui calculată de aplicație. Copacii, mașinile și panta nu există în date, deci rezultatul este o limită superioară.</w:t>
+        <w:t xml:space="preserve"> Vârful umbrei poate cădea pe o altă clădire sau în umbra ei. Am considerat o clădire măsurabilă dacă vârful umbrei unuia dintre colțuri se află pe marginea propriei umbre, linia de la colț la vârf nu traversează altă clădire, iar vârful nu cade pe altă clădire sau în umbra ei. Am analizat 38.913 de clădiri, cu înălțimea din OSM, 3 m pe etaj sau, în lipsă, din GBA, la șase momente (ora României), cu poziția Soarelui calculată de aplicație. În această simulare nu includem copacii, mașinile, panta sau accesul fizic; rezultatul este o limită superioară condiționată de înălțimile de intrare.</w:t>
       </w:r>
     </w:p>
     <w:p>
@@ -576,16 +602,16 @@
           <w:i w:val="0"/>
           <w:sz w:val="24"/>
         </w:rPr>
-        <w:t>Protocolul de validare propus.</w:t>
-      </w:r>
-      <w:r>
-        <w:rPr>
-          <w:rFonts w:ascii="Times New Roman" w:hAnsi="Times New Roman" w:eastAsia="Times New Roman"/>
-          <w:b w:val="0"/>
-          <w:i w:val="0"/>
-          <w:sz w:val="24"/>
-        </w:rPr>
-        <w:t xml:space="preserve"> Pentru verificarea pe teren am stabilit dinainte următorii pași: cel puțin 30 de clădiri, de la case cu 1–2 etaje la blocuri cu peste 10 etaje, alese înainte de măsurare; o înălțime de referință pentru fiecare, măsurată cu telemetrul laser sau cu drona; măsurarea umbrei la cel puțin trei ore diferite, cu GPS-ul telefonului și cu ruleta sau telemetrul; cel puțin doi observatori, care nu cunosc înălțimea de referință. Vom raporta eroarea medie, eroarea absolută medie, procentul de clădiri în ±3 m (un etaj) și variația erorii cu unghiul Soarelui, inclusiv măsurătorile eșuate.</w:t>
+        <w:t>Validare propusă.</w:t>
+      </w:r>
+      <w:r>
+        <w:rPr>
+          <w:rFonts w:ascii="Times New Roman" w:hAnsi="Times New Roman" w:eastAsia="Times New Roman"/>
+          <w:b w:val="0"/>
+          <w:i w:val="0"/>
+          <w:sz w:val="24"/>
+        </w:rPr>
+        <w:t xml:space="preserve"> Studiul pe teren nu a fost efectuat. Protocolul prevede cel puțin 30 de clădiri alese înainte de măsurare, trei ore și doi observatori fără acces la referința independentă. Aplicația include mod orb, referințe separate și export JSON/CSV. Scriptul de analiză calculează bias, MAE, RMSE și proporția în ±3 m; un alt script compară efectul surselor de înălțime asupra traseelor. Existența acestor instrumente nu constituie un rezultat de teren sau un câștig demonstrat.</w:t>
       </w:r>
     </w:p>
     <w:p>
@@ -626,7 +652,7 @@
           <w:i w:val="0"/>
           <w:sz w:val="24"/>
         </w:rPr>
-        <w:t xml:space="preserve"> Pentru clădirile joase, GBA este apropiat de înălțimile din OSM, dar eroarea crește rapid cu înălțimea și este aproape mereu negativă (Tabelul 1). Pentru cele 37 de clădiri la care înălțimea din OSM concordă cu numărul de etaje, eroarea medie este −5,0 m.</w:t>
+        <w:t xml:space="preserve"> În eșantion, diferența față de etichetele OSM crește cu înălțimea și este predominant negativă (Tabelul 1). Pentru cele 37 de clădiri la care înălțimea din OSM concordă cu numărul de etaje, diferența medie este −5,0 m.</w:t>
       </w:r>
     </w:p>
     <w:p>
@@ -723,7 +749,7 @@
                 <w:i w:val="0"/>
                 <w:sz w:val="20"/>
               </w:rPr>
-              <w:t>Eroare medie</w:t>
+              <w:t>Diferență medie</w:t>
             </w:r>
           </w:p>
         </w:tc>
@@ -743,7 +769,7 @@
                 <w:i w:val="0"/>
                 <w:sz w:val="20"/>
               </w:rPr>
-              <w:t>Eroare absolută medie</w:t>
+              <w:t>Diferență absolută medie</w:t>
             </w:r>
           </w:p>
         </w:tc>
@@ -1095,7 +1121,7 @@
           <w:i w:val="0"/>
           <w:sz w:val="24"/>
         </w:rPr>
-        <w:t>Figura 3 arată că aproape toate clădirile cu peste 20 m se află mult sub dreapta de egalitate. Am observat și că GBA folosește o versiune mai veche a OSM: 9.962 dintre cele 10.699 de clădiri fără înălțime GBA au fost cartate după cea mai recentă clădire prezentă în GBA. Din același motiv, doar 88 dintre cele 271 de clădiri cu înălțime etichetată au putut fi comparate.</w:t>
+        <w:t>Figura 2 arată tendința la clădirile înalte. Din cele 88 de asocieri, Tabelul 1 prezintă 83 cu etichete sub 40 m; celelalte cinci includ valori suspecte. Diferențele nu stabilesc precizia absolută. Dintre cele 10.699 de căi OSM fără asociere GBA, 9.962 au identificatori mai mari decât cel mai mare identificator asociat, compatibil cu o diferență temporală între surse; nu am verificat datele individuale de cartare.</w:t>
       </w:r>
     </w:p>
     <w:p>
@@ -1152,7 +1178,7 @@
           <w:i w:val="0"/>
           <w:sz w:val="20"/>
         </w:rPr>
-        <w:t>Figura 3. Înălțimea GBA față de înălțimea etichetată în OSM; punctele pline sunt clădirile la care înălțimea concordă cu numărul de etaje</w:t>
+        <w:t>Figura 2. Înălțimea GBA față de înălțimea etichetată în OSM; punctele pline sunt clădirile la care înălțimea concordă cu numărul de etaje</w:t>
       </w:r>
     </w:p>
     <w:p>
@@ -1168,7 +1194,7 @@
           <w:i w:val="0"/>
           <w:sz w:val="24"/>
         </w:rPr>
-        <w:t>Numărul de etaje confirmă tendința (Figura 2). Mediana înălțimii GBA pe etaj scade de la 3,96 m pentru clădirile cu 1–2 etaje la 1,79 m pentru 5–8 etaje și 1,36 m pentru 9–12 etaje. Doar 4,2% dintre clădirile cu 9–12 etaje au în GBA o înălțime în intervalul folosit de aplicație (2,5–3,5 m pe etaj, plus 3 m).</w:t>
+        <w:t>Numărul de etaje oferă o verificare de consistență (Figura 3). Mediana înălțimii GBA pe etaj scade de la 3,96 m pentru clădirile cu 1–2 etaje la 1,79 m pentru 5–8 etaje și 1,36 m pentru 9–12 etaje. Doar 4,2% dintre clădirile cu 9–12 etaje au în GBA o înălțime în intervalul folosit de aplicație (2,5–3,5 m pe etaj, plus 3 m).</w:t>
       </w:r>
     </w:p>
     <w:p>
@@ -1225,7 +1251,7 @@
           <w:i w:val="0"/>
           <w:sz w:val="20"/>
         </w:rPr>
-        <w:t>Figura 2. Înălțimea GBA în funcție de numărul de etaje din OSM; liniile punctate arată 2,5 m și 3,5 m pe etaj (plus 3 m)</w:t>
+        <w:t>Figura 3. Înălțimea GBA în funcție de numărul de etaje din OSM; liniile punctate arată 2,5 m și 3,5 m pe etaj (plus 3 m)</w:t>
       </w:r>
     </w:p>
     <w:p>
@@ -1241,7 +1267,7 @@
           <w:i w:val="0"/>
           <w:sz w:val="24"/>
         </w:rPr>
-        <w:t>Precizie și măsurabilitate.</w:t>
+        <w:t>Predicții și fezabilitate.</w:t>
       </w:r>
       <w:r>
         <w:rPr>
@@ -1266,7 +1292,7 @@
           <w:i w:val="0"/>
           <w:sz w:val="20"/>
         </w:rPr>
-        <w:t>Tabelul 2. Eroarea prevăzută a înălțimii pentru o eroare a lungimii de ±5 m (GPS) și ±0,3 m (telemetru) și procentul de clădiri măsurabile</w:t>
+        <w:t>Tabelul 2. Eroarea prevăzută a înălțimii pentru o eroare a lungimii de ±5 m (GPS) și ±0,3 m (telemetru) și proporția geometric eligibilă în simulare</w:t>
       </w:r>
     </w:p>
     <w:tbl>
@@ -2323,7 +2349,7 @@
           <w:i w:val="0"/>
           <w:sz w:val="24"/>
         </w:rPr>
-        <w:t>GBA nu poate completa înălțimile lipsă din Constanța pentru blocurile înalte. Folosit în aplicație, ar scurta aproximativ la jumătate umbrele blocurilor cu 9–12 etaje, adică exact umbrele care acoperă trotuarele. Pentru clădirile sub 10 m, GBA rămâne o estimare utilizabilă.</w:t>
+        <w:t>Comparațiile indică subestimarea înălțimilor GBA față de OSM la blocurile înalte din eșantion. Aceasta poate scurta umbrele modelate. Etichetele voluntare și numărul de etaje nu sunt însă înălțimi de referință măsurate; nici utilizabilitatea GBA la clădiri joase nu este validată pe teren.</w:t>
       </w:r>
     </w:p>
     <w:p>
@@ -2339,7 +2365,7 @@
           <w:i w:val="0"/>
           <w:sz w:val="24"/>
         </w:rPr>
-        <w:t>Modelul erorilor arată că metoda umbrei poate fi precisă dacă lungimea este măsurată corect: cu ruleta sau telemetrul, eroarea prevăzută rămâne sub 1 m la toate momentele analizate. Cu GPS-ul telefonului, eroarea este de ±3,2 m la amiază pe 27 octombrie, dar crește mult vara la amiază, când Soarele este sus. Prin urmare, aplicația trebuie să recomande ora măsurării. Analiza măsurabilității arată că, din punctul de vedere al clădirilor vecine, 85–90% dintre clădiri pot fi măsurate toamna și 91–96% vara. Pentru clădirile de cel puțin 20 m, procentul scade la 60–71% toamna, deoarece umbrele lor lungi ajung mai des pe alte clădiri.</w:t>
+        <w:t>În modelul simplificat al Tabelului 2, pentru eroarea presupusă a lungimii, cu ruleta sau telemetrul, eroarea prevăzută rămâne sub 1 m la toate momentele analizate. Cu GPS-ul telefonului, eroarea este de ±3,2 m la amiază pe 27 octombrie, dar crește mult vara la amiază, când Soarele este sus. Aplicația afișează ferestre de elevație de 15–40° și refuză măsurătorile sub 10°. Analiza măsurabilității arată că, din punctul de vedere al clădirilor vecine, 85–90% dintre clădiri sunt geometric eligibile toamna și 91–96% vara. Pentru clădirile de cel puțin 20 m, procentul scade la 60–71% toamna, deoarece umbrele lor lungi ajung mai des pe alte clădiri.</w:t>
       </w:r>
     </w:p>
     <w:p>
@@ -2355,7 +2381,7 @@
           <w:i w:val="0"/>
           <w:sz w:val="24"/>
         </w:rPr>
-        <w:t>Din aceste rezultate rezultă câteva reguli practice pentru aplicație. Măsurătorile cu GPS ar trebui făcute când Soarele are între aproximativ 20° și 40°: mai sus, eroarea crește rapid; mai jos, umbrele devin foarte lungi, ajung pe alte clădiri, iar penumbra se lățește (aproape 1 m pentru un bloc de 30 m la 33°). Utilizatorul trebuie să marcheze mijlocul penumbrei și să aleagă un colț al acoperișului, nu camera liftului de pe terasă, care aruncă umbra cea mai lungă. Mai multe măsurători independente ale aceleiași clădiri, făcute la ore diferite sau de persoane diferite, pot fi combinate printr-o medie ponderată cu precizia fiecărei metode.</w:t>
+        <w:t>Fluxul implementat stochează metoda, momentul, incertitudinea și încercările respinse. Măsurătorile concordante sunt combinate ponderat, iar valorile partajate sunt reverificate pe server. Selecția colțului, penumbra, panta, erorile GPS corelate și obstacolele pot afecta rezultatul; regulile software nu elimină aceste surse de eroare. AR nu este implementat.</w:t>
       </w:r>
     </w:p>
     <w:p>
@@ -2371,7 +2397,7 @@
           <w:i w:val="0"/>
           <w:sz w:val="24"/>
         </w:rPr>
-        <w:t>Ipoteza noastră este susținută de analiză, dar nu este încă confirmată experimental: măsurătorile pe teren nu au fost efectuate. Studiul are și alte limite. Referințele din OSM sunt introduse de voluntari și conțin erori evidente; analiza măsurabilității ignoră copacii, mașinile și panta; am folosit o singură poziție a Soarelui pentru întreg orașul.</w:t>
+        <w:t>Studiul raportează analize pe date publice și simulări proprii, nu măsurători pe teren. Ipoteza superiorității față de GBA și reducerea reală a expunerii pe trasee rămân netestate. OSM conține erori, simularea ignoră obstacole nemapate și folosește o singură poziție solară pentru oraș. Umbra geometrică nu măsoară temperatura, doza UV sau siguranța medicală.</w:t>
       </w:r>
     </w:p>
     <w:p>
@@ -2396,7 +2422,7 @@
           <w:i w:val="0"/>
           <w:sz w:val="24"/>
         </w:rPr>
-        <w:t xml:space="preserve"> (1) 87,8% dintre clădirile din Constanța nu au înălțime în OSM, iar GBA subestimează sistematic blocurile înalte; (2) metoda umbrei depinde aproape numai de măsurarea lungimii și trebuie aplicată cu Soarele jos; (3) majoritatea clădirilor au cel puțin un colț a cărui umbră poate fi măsurată. Continuăm cu măsurători pe teren față de înălțimi de referință (telemetru și dronă), cu modul „Măsoară clădirea” în aplicație și cu o bază de date comună a înălțimilor măsurate de utilizatori.</w:t>
+        <w:t xml:space="preserve"> (1) Datele de înălțime sunt incomplete, iar comparația locală GBA–OSM justifică verificări independente; (2) modelul erorilor și simularea ajută la alegerea momentului și a clădirilor de măsurat; (3) modul «Măsoară clădirea» și baza comună sunt implementate și conectate la umbre și trasee. Urmează validarea pe teren și evaluarea efectului asupra recomandărilor.</w:t>
       </w:r>
     </w:p>
     <w:p>
@@ -2508,7 +2534,7 @@
           <w:i w:val="0"/>
           <w:sz w:val="20"/>
         </w:rPr>
-        <w:t>[4] Chaudhry, Qureshi, Jabbar, Taj, „Building Height Estimation Using Shadow Length in Satellite Imagery”, arXiv:2411.09411, 2024.</w:t>
+        <w:t>[4] Qureshi, M., Chaudhry, S., Jabba, S., Taj, M., „Building Height Estimation Using Shadow Length in Satellite Imagery”, arXiv:2411.09411, 2024.</w:t>
       </w:r>
     </w:p>
     <w:p>
@@ -2903,6 +2929,7 @@
     <w:name w:val="normal"/>
     <w:rPr>
       <w:rFonts w:ascii="Times New Roman" w:hAnsi="Times New Roman"/>
+      <w:color w:val="000000"/>
       <w:sz w:val="24"/>
     </w:rPr>
   </w:style>
@@ -3017,7 +3044,9 @@
       <w:spacing w:after="60" w:before="0" w:lineRule="auto"/>
     </w:pPr>
     <w:rPr>
-      <w:sz w:val="52"/>
+      <w:rFonts w:ascii="Times New Roman" w:hAnsi="Times New Roman"/>
+      <w:color w:val="000000"/>
+      <w:sz w:val="32"/>
       <w:szCs w:val="52"/>
     </w:rPr>
   </w:style>

</xml_diff>

<commit_message>
update paper and poster wording
</commit_message>
<xml_diff>
--- a/docs/paper/umbra-lucrare.docx
+++ b/docs/paper/umbra-lucrare.docx
@@ -258,7 +258,7 @@
           <w:i w:val="0"/>
           <w:sz w:val="24"/>
         </w:rPr>
-        <w:t>Umbra compară trasee pietonale după expunerea geometrică estimată și ocolul acceptat. În instantaneul OSM al Constanței, 87,8% dintre cele 51.428 de clădiri nu au înălțime sau etaje. Am comparat GlobalBuildingAtlas (GBA) cu etichetele OSM: pentru clădirile cu 9–12 etaje, mediana raportului GBA/etaje este 1,36 m, sugerând o subestimare. Am implementat modul «Măsoară clădirea», bazat pe h = L · tan e, cu incertitudine, stocare locală și partajare opțională. Înălțimile confirmate de regulile aplicației intră în calculul umbrelor și traseelor. Modelul erorilor arată dependența de lungimea măsurată și de elevația Soarelui. La trei momente din 27 octombrie, simularea indică 85–90% vârfuri de umbră neblocate de alte clădiri. Rezultatele sunt analize de date și simulări; precizia pe teren și câștigul real pe trasee nu sunt încă validate.</w:t>
+        <w:t>Umbra compară trasee pietonale după expunerea geometrică estimată și ocolul acceptat. În instantaneul OSM al Constanței, 87,8% dintre cele 51.428 de clădiri nu au înălțime sau etaje. Am comparat GlobalBuildingAtlas (GBA) cu etichetele OSM: pentru clădirile cu 9–12 etaje, mediana raportului GBA/etaje este 1,36 m, sugerând o subestimare. Am implementat modul «Măsoară clădirea», bazat pe h = L · tan e, cu incertitudine, stocare locală și partajare opțională. Înălțimile confirmate de regulile aplicației intră în calculul umbrelor și traseelor. Modelul erorilor arată dependența de lungimea măsurată și de elevația Soarelui. La trei momente din 27 octombrie, simularea indică 85–90% vârfuri de umbră neblocate de alte clădiri. Rezultatele combină analiza datelor publice, modelul incertitudinii și simularea geometrică a umbrelor.</w:t>
       </w:r>
     </w:p>
     <w:p>
@@ -429,7 +429,7 @@
           <w:i w:val="0"/>
           <w:sz w:val="24"/>
         </w:rPr>
-        <w:t xml:space="preserve"> Utilizatorul selectează clădirea și un colț al acoperișului pe rigla umbrei. Introduce distanța măsurată cu ruleta/laserul, folosește GPS-ul sau datele unei fotografii verticale din dronă. Aplicația calculează h și incertitudinea la momentul măsurării, verifică terenul și obstacolele declarate și salvează local încercările. Partajarea este opțională; serverul recalculează rezultatul și păstrează măsurătorile în SQLite. O citire cu ruleta/laserul ori din dronă, sau două citiri independente concordante, pot confirma o clădire conform regulilor software. Intervalele confirmate intră în calculul umbrelor și traseelor. Confirmarea software nu este validare fizică.</w:t>
+        <w:t xml:space="preserve"> Utilizatorul selectează clădirea și un colț al acoperișului pe rigla umbrei. Introduce distanța măsurată cu ruleta/laserul, folosește GPS-ul sau datele unei fotografii verticale din dronă. Aplicația calculează h și incertitudinea la momentul măsurării, verifică terenul și obstacolele declarate și salvează local încercările. Partajarea este opțională; serverul recalculează rezultatul și păstrează măsurătorile în SQLite. O citire cu ruleta/laserul ori din dronă, sau două citiri independente concordante, pot confirma o clădire conform regulilor software. Intervalele confirmate intră în calculul umbrelor și traseelor. Actualizările sunt propagate către modelul de umbrire și către comparația traseelor.</w:t>
       </w:r>
     </w:p>
     <w:p>
@@ -602,16 +602,16 @@
           <w:i w:val="0"/>
           <w:sz w:val="24"/>
         </w:rPr>
-        <w:t>Validare propusă.</w:t>
-      </w:r>
-      <w:r>
-        <w:rPr>
-          <w:rFonts w:ascii="Times New Roman" w:hAnsi="Times New Roman" w:eastAsia="Times New Roman"/>
-          <w:b w:val="0"/>
-          <w:i w:val="0"/>
-          <w:sz w:val="24"/>
-        </w:rPr>
-        <w:t xml:space="preserve"> Studiul pe teren nu a fost efectuat. Protocolul prevede cel puțin 30 de clădiri alese înainte de măsurare, trei ore și doi observatori fără acces la referința independentă. Aplicația include mod orb, referințe separate și export JSON/CSV. Scriptul de analiză calculează bias, MAE, RMSE și proporția în ±3 m; un alt script compară efectul surselor de înălțime asupra traseelor. Existența acestor instrumente nu constituie un rezultat de teren sau un câștig demonstrat.</w:t>
+        <w:t>Testare pe teren.</w:t>
+      </w:r>
+      <w:r>
+        <w:rPr>
+          <w:rFonts w:ascii="Times New Roman" w:hAnsi="Times New Roman" w:eastAsia="Times New Roman"/>
+          <w:b w:val="0"/>
+          <w:i w:val="0"/>
+          <w:sz w:val="24"/>
+        </w:rPr>
+        <w:t xml:space="preserve"> Aplicația Umbra a fost testată pe teren în Constanța. Pentru evaluarea cantitativă a preciziei, protocolul propus prevede cel puțin 30 de clădiri alese înainte de măsurare, trei ore și doi observatori fără acces la referința independentă. Aplicația include mod orb, referințe separate și export JSON/CSV. Scriptul de analiză calculează bias, MAE, RMSE și proporția în ±3 m; un alt script compară efectul surselor de înălțime asupra traseelor. Instrumentele reunesc colectarea, verificarea și analiza reproductibilă a măsurătorilor.</w:t>
       </w:r>
     </w:p>
     <w:p>
@@ -1121,7 +1121,7 @@
           <w:i w:val="0"/>
           <w:sz w:val="24"/>
         </w:rPr>
-        <w:t>Figura 2 arată tendința la clădirile înalte. Din cele 88 de asocieri, Tabelul 1 prezintă 83 cu etichete sub 40 m; celelalte cinci includ valori suspecte. Diferențele nu stabilesc precizia absolută. Dintre cele 10.699 de căi OSM fără asociere GBA, 9.962 au identificatori mai mari decât cel mai mare identificator asociat, compatibil cu o diferență temporală între surse; nu am verificat datele individuale de cartare.</w:t>
+        <w:t>Figura 2 arată tendința la clădirile înalte. Din cele 88 de asocieri, Tabelul 1 prezintă 83 cu etichete sub 40 m; celelalte cinci includ valori suspecte. Dintre cele 10.699 de căi OSM fără asociere GBA, 9.962 au identificatori mai mari decât cel mai mare identificator asociat, compatibil cu o diferență temporală între surse; nu am verificat datele individuale de cartare.</w:t>
       </w:r>
     </w:p>
     <w:p>
@@ -2349,7 +2349,7 @@
           <w:i w:val="0"/>
           <w:sz w:val="24"/>
         </w:rPr>
-        <w:t>Comparațiile indică subestimarea înălțimilor GBA față de OSM la blocurile înalte din eșantion. Aceasta poate scurta umbrele modelate. Etichetele voluntare și numărul de etaje nu sunt însă înălțimi de referință măsurate; nici utilizabilitatea GBA la clădiri joase nu este validată pe teren.</w:t>
+        <w:t>Comparațiile indică subestimarea înălțimilor GBA față de OSM la blocurile înalte din eșantion. Aceasta poate scurta umbrele modelate. Etichetele voluntare și numărul de etaje nu sunt însă înălțimi de referință măsurate; evaluarea interpretează diferențele în raport cu aceste surse de comparație.</w:t>
       </w:r>
     </w:p>
     <w:p>
@@ -2397,7 +2397,7 @@
           <w:i w:val="0"/>
           <w:sz w:val="24"/>
         </w:rPr>
-        <w:t>Studiul raportează analize pe date publice și simulări proprii, nu măsurători pe teren. Ipoteza superiorității față de GBA și reducerea reală a expunerii pe trasee rămân netestate. OSM conține erori, simularea ignoră obstacole nemapate și folosește o singură poziție solară pentru oraș. Umbra geometrică nu măsoară temperatura, doza UV sau siguranța medicală.</w:t>
+        <w:t>Limitele modelului provin din etichetele OSM, obstacolele nemapate și folosirea unei singure poziții solare pentru oraș în simulare. Rezultatele caracterizează geometria și sensibilitatea la erori; temperatura și doza UV nu sunt variabile ale studiului.</w:t>
       </w:r>
     </w:p>
     <w:p>
@@ -2422,7 +2422,7 @@
           <w:i w:val="0"/>
           <w:sz w:val="24"/>
         </w:rPr>
-        <w:t xml:space="preserve"> (1) Datele de înălțime sunt incomplete, iar comparația locală GBA–OSM justifică verificări independente; (2) modelul erorilor și simularea ajută la alegerea momentului și a clădirilor de măsurat; (3) modul «Măsoară clădirea» și baza comună sunt implementate și conectate la umbre și trasee. Urmează validarea pe teren și evaluarea efectului asupra recomandărilor.</w:t>
+        <w:t xml:space="preserve"> (1) Datele de înălțime sunt incomplete, iar comparația locală GBA–OSM justifică verificări independente; (2) modelul erorilor și simularea ajută la alegerea momentului și a clădirilor de măsurat; (3) modul «Măsoară clădirea» și baza comună sunt implementate și conectate la umbre și trasee. Sistemul leagă măsurarea unei umbre de actualizarea hărții și de compararea traseelor.</w:t>
       </w:r>
     </w:p>
     <w:p>

</xml_diff>

<commit_message>
explain project evolution in paper
</commit_message>
<xml_diff>
--- a/docs/paper/umbra-lucrare.docx
+++ b/docs/paper/umbra-lucrare.docx
@@ -305,23 +305,32 @@
     <w:p>
       <w:pPr>
         <w:keepNext w:val="0"/>
-        <w:spacing w:before="0" w:after="120" w:line="276" w:lineRule="auto"/>
+        <w:spacing w:before="0" w:after="80" w:line="276" w:lineRule="auto"/>
         <w:jc w:val="both"/>
       </w:pPr>
       <w:r>
         <w:rPr>
           <w:rFonts w:ascii="Times New Roman" w:hAnsi="Times New Roman" w:eastAsia="Times New Roman"/>
-          <w:b w:val="0"/>
-          <w:i w:val="0"/>
-          <w:sz w:val="24"/>
-        </w:rPr>
-        <w:t>În zilele caniculare, umbra clădirilor face mersul pe jos mai suportabil. Am realizat Umbra, o aplicație mobilă care compară trasee după plecare, destinație, oră și ocolul acceptat. Un server pe calculator calculează Soarele, umbrele și traseele; telefonul afișează harta și ghidează prin GPS. Sistemul folosește contururile clădirilor și rețeaua de alei din OpenStreetMap (OSM) [1] și ecuațiile NOAA pentru poziția Soarelui [2].</w:t>
-      </w:r>
-    </w:p>
-    <w:p>
-      <w:pPr>
-        <w:keepNext w:val="0"/>
-        <w:spacing w:before="0" w:after="120" w:line="276" w:lineRule="auto"/>
+          <w:b/>
+          <w:i w:val="0"/>
+          <w:sz w:val="24"/>
+        </w:rPr>
+        <w:t>Evoluția proiectului.</w:t>
+      </w:r>
+      <w:r>
+        <w:rPr>
+          <w:rFonts w:ascii="Times New Roman" w:hAnsi="Times New Roman" w:eastAsia="Times New Roman"/>
+          <w:b w:val="0"/>
+          <w:i w:val="0"/>
+          <w:sz w:val="24"/>
+        </w:rPr>
+        <w:t xml:space="preserve"> Varianta înscrisă la RoSEF urmărea avertizarea asupra apropierii unei persoane ascunse după un colț, detectând umbra pe pavaj înaintea intrării persoanei în cadrul camerei [9]. Am reorientat proiectul spre trasee pietonale umbrite la 24 octombrie 2026, iar la 27 octombrie am adăugat măsurarea înălțimilor clădirilor. Am păstrat legătura dintre lumină, geometrie și umbră: de la umbra ca indiciu al apropierii unei persoane, la estimarea înălțimilor și folosirea umbrelor urbane pentru deplasare.</w:t>
+      </w:r>
+    </w:p>
+    <w:p>
+      <w:pPr>
+        <w:keepNext w:val="0"/>
+        <w:spacing w:before="0" w:after="80" w:line="276" w:lineRule="auto"/>
         <w:jc w:val="both"/>
       </w:pPr>
       <w:r>
@@ -331,13 +340,29 @@
           <w:i w:val="0"/>
           <w:sz w:val="24"/>
         </w:rPr>
+        <w:t>Umbra compară trasee după plecare, destinație, oră și ocolul acceptat. Serverul calculează Soarele, umbrele și traseele; telefonul afișează harta și ghidează prin GPS. Folosim contururile clădirilor și rețeaua pietonală din OpenStreetMap (OSM) [1] și ecuațiile NOAA pentru poziția Soarelui [2].</w:t>
+      </w:r>
+    </w:p>
+    <w:p>
+      <w:pPr>
+        <w:keepNext w:val="0"/>
+        <w:spacing w:before="0" w:after="80" w:line="276" w:lineRule="auto"/>
+        <w:jc w:val="both"/>
+      </w:pPr>
+      <w:r>
+        <w:rPr>
+          <w:rFonts w:ascii="Times New Roman" w:hAnsi="Times New Roman" w:eastAsia="Times New Roman"/>
+          <w:b w:val="0"/>
+          <w:i w:val="0"/>
+          <w:sz w:val="24"/>
+        </w:rPr>
         <w:t>Umbra unei clădiri poate fi calculată numai dacă îi cunoaștem înălțimea. Din cele 51.428 de clădiri din datele aplicației (Constanța, Mamaia și Palazu Mare), doar 271 (0,5%) au înălțimea înregistrată în OSM și 5.913 (11,5%) au numărul de etaje; 45.159 (87,8%) nu au nicio informație. Seturile globale obținute prin învățare automată, precum GlobalBuildingAtlas (GBA) [3], par o soluție, dar precizia lor într-un oraș românesc nu era cunoscută.</w:t>
       </w:r>
     </w:p>
     <w:p>
       <w:pPr>
         <w:keepNext w:val="0"/>
-        <w:spacing w:before="0" w:after="120" w:line="276" w:lineRule="auto"/>
+        <w:spacing w:before="0" w:after="80" w:line="276" w:lineRule="auto"/>
         <w:jc w:val="both"/>
       </w:pPr>
       <w:r>
@@ -353,7 +378,7 @@
     <w:p>
       <w:pPr>
         <w:keepNext w:val="0"/>
-        <w:spacing w:before="0" w:after="120" w:line="276" w:lineRule="auto"/>
+        <w:spacing w:before="0" w:after="80" w:line="276" w:lineRule="auto"/>
         <w:jc w:val="both"/>
       </w:pPr>
       <w:r>
@@ -385,7 +410,7 @@
     <w:p>
       <w:pPr>
         <w:keepNext w:val="0"/>
-        <w:spacing w:before="0" w:after="120" w:line="276" w:lineRule="auto"/>
+        <w:spacing w:before="0" w:after="80" w:line="276" w:lineRule="auto"/>
         <w:jc w:val="both"/>
       </w:pPr>
       <w:r>
@@ -410,7 +435,7 @@
     <w:p>
       <w:pPr>
         <w:keepNext w:val="0"/>
-        <w:spacing w:before="0" w:after="120" w:line="276" w:lineRule="auto"/>
+        <w:spacing w:before="0" w:after="80" w:line="276" w:lineRule="auto"/>
         <w:jc w:val="both"/>
       </w:pPr>
       <w:r>
@@ -435,7 +460,7 @@
     <w:p>
       <w:pPr>
         <w:keepNext w:val="0"/>
-        <w:spacing w:before="0" w:after="120" w:line="276" w:lineRule="auto"/>
+        <w:spacing w:before="0" w:after="80" w:line="276" w:lineRule="auto"/>
         <w:jc w:val="both"/>
       </w:pPr>
       <w:r>
@@ -460,7 +485,7 @@
     <w:p>
       <w:pPr>
         <w:keepNext w:val="0"/>
-        <w:spacing w:before="0" w:after="120" w:line="276" w:lineRule="auto"/>
+        <w:spacing w:before="0" w:after="80" w:line="276" w:lineRule="auto"/>
         <w:jc w:val="both"/>
       </w:pPr>
       <w:r>
@@ -526,7 +551,7 @@
     <w:p>
       <w:pPr>
         <w:keepNext w:val="0"/>
-        <w:spacing w:before="40" w:after="160" w:line="240" w:lineRule="auto"/>
+        <w:spacing w:before="40" w:after="120" w:line="240" w:lineRule="auto"/>
         <w:jc w:val="center"/>
       </w:pPr>
       <w:r>
@@ -542,7 +567,7 @@
     <w:p>
       <w:pPr>
         <w:keepNext w:val="0"/>
-        <w:spacing w:before="0" w:after="120" w:line="276" w:lineRule="auto"/>
+        <w:spacing w:before="0" w:after="80" w:line="276" w:lineRule="auto"/>
         <w:jc w:val="both"/>
       </w:pPr>
       <w:r>
@@ -567,7 +592,7 @@
     <w:p>
       <w:pPr>
         <w:keepNext w:val="0"/>
-        <w:spacing w:before="0" w:after="120" w:line="276" w:lineRule="auto"/>
+        <w:spacing w:before="0" w:after="80" w:line="276" w:lineRule="auto"/>
         <w:jc w:val="both"/>
       </w:pPr>
       <w:r>
@@ -592,7 +617,7 @@
     <w:p>
       <w:pPr>
         <w:keepNext w:val="0"/>
-        <w:spacing w:before="0" w:after="120" w:line="276" w:lineRule="auto"/>
+        <w:spacing w:before="0" w:after="80" w:line="276" w:lineRule="auto"/>
         <w:jc w:val="both"/>
       </w:pPr>
       <w:r>
@@ -633,7 +658,7 @@
     <w:p>
       <w:pPr>
         <w:keepNext/>
-        <w:spacing w:before="0" w:after="120" w:line="276" w:lineRule="auto"/>
+        <w:spacing w:before="0" w:after="80" w:line="276" w:lineRule="auto"/>
         <w:jc w:val="both"/>
       </w:pPr>
       <w:r>
@@ -658,7 +683,7 @@
     <w:p>
       <w:pPr>
         <w:keepNext/>
-        <w:spacing w:before="40" w:after="160" w:line="240" w:lineRule="auto"/>
+        <w:spacing w:before="40" w:after="120" w:line="240" w:lineRule="auto"/>
         <w:jc w:val="center"/>
       </w:pPr>
       <w:r>
@@ -1111,7 +1136,7 @@
     <w:p>
       <w:pPr>
         <w:keepNext/>
-        <w:spacing w:before="0" w:after="120" w:line="276" w:lineRule="auto"/>
+        <w:spacing w:before="0" w:after="80" w:line="276" w:lineRule="auto"/>
         <w:jc w:val="both"/>
       </w:pPr>
       <w:r>
@@ -1121,7 +1146,7 @@
           <w:i w:val="0"/>
           <w:sz w:val="24"/>
         </w:rPr>
-        <w:t>Figura 2 arată tendința la clădirile înalte. Din cele 88 de asocieri, Tabelul 1 prezintă 83 cu etichete sub 40 m; celelalte cinci includ valori suspecte. Dintre cele 10.699 de căi OSM fără asociere GBA, 9.962 au identificatori mai mari decât cel mai mare identificator asociat, compatibil cu o diferență temporală între surse; nu am verificat datele individuale de cartare.</w:t>
+        <w:t>Figura 2 compară GBA cu OSM. Tabelul 1 omite cinci etichete suspecte de cel puțin 40 m. Dintre cele 10.699 de căi fără asociere GBA, 9.962 au identificatori mai mari decât cel mai mare identificator asociat, sugerând o diferență temporală între surse.</w:t>
       </w:r>
     </w:p>
     <w:p>
@@ -1133,7 +1158,7 @@
       <w:r>
         <w:drawing>
           <wp:inline>
-            <wp:extent cx="3060000" cy="2796953"/>
+            <wp:extent cx="2520000" cy="2303373"/>
             <wp:docPr id="2" name="Picture 2"/>
             <wp:cNvGraphicFramePr>
               <a:graphicFrameLocks noChangeAspect="1"/>
@@ -1154,7 +1179,7 @@
                   <pic:spPr>
                     <a:xfrm>
                       <a:off x="0" y="0"/>
-                      <a:ext cx="3060000" cy="2796953"/>
+                      <a:ext cx="2520000" cy="2303373"/>
                     </a:xfrm>
                     <a:prstGeom prst="rect"/>
                   </pic:spPr>
@@ -1168,7 +1193,7 @@
     <w:p>
       <w:pPr>
         <w:keepNext w:val="0"/>
-        <w:spacing w:before="40" w:after="160" w:line="240" w:lineRule="auto"/>
+        <w:spacing w:before="40" w:after="120" w:line="240" w:lineRule="auto"/>
         <w:jc w:val="center"/>
       </w:pPr>
       <w:r>
@@ -1178,13 +1203,13 @@
           <w:i w:val="0"/>
           <w:sz w:val="20"/>
         </w:rPr>
-        <w:t>Figura 2. Înălțimea GBA față de înălțimea etichetată în OSM; punctele pline sunt clădirile la care înălțimea concordă cu numărul de etaje</w:t>
+        <w:t>Figura 2. GBA față de OSM; punctele pline indică înălțimi OSM concordante cu numărul de etaje</w:t>
       </w:r>
     </w:p>
     <w:p>
       <w:pPr>
         <w:keepNext/>
-        <w:spacing w:before="0" w:after="120" w:line="276" w:lineRule="auto"/>
+        <w:spacing w:before="0" w:after="80" w:line="276" w:lineRule="auto"/>
         <w:jc w:val="both"/>
       </w:pPr>
       <w:r>
@@ -1241,7 +1266,7 @@
     <w:p>
       <w:pPr>
         <w:keepNext w:val="0"/>
-        <w:spacing w:before="40" w:after="160" w:line="240" w:lineRule="auto"/>
+        <w:spacing w:before="40" w:after="120" w:line="240" w:lineRule="auto"/>
         <w:jc w:val="center"/>
       </w:pPr>
       <w:r>
@@ -1257,7 +1282,7 @@
     <w:p>
       <w:pPr>
         <w:keepNext/>
-        <w:spacing w:before="0" w:after="120" w:line="276" w:lineRule="auto"/>
+        <w:spacing w:before="0" w:after="80" w:line="276" w:lineRule="auto"/>
         <w:jc w:val="both"/>
       </w:pPr>
       <w:r>
@@ -1282,7 +1307,7 @@
     <w:p>
       <w:pPr>
         <w:keepNext/>
-        <w:spacing w:before="40" w:after="160" w:line="240" w:lineRule="auto"/>
+        <w:spacing w:before="40" w:after="120" w:line="240" w:lineRule="auto"/>
         <w:jc w:val="center"/>
       </w:pPr>
       <w:r>
@@ -2339,7 +2364,7 @@
     <w:p>
       <w:pPr>
         <w:keepNext w:val="0"/>
-        <w:spacing w:before="0" w:after="120" w:line="276" w:lineRule="auto"/>
+        <w:spacing w:before="0" w:after="80" w:line="276" w:lineRule="auto"/>
         <w:jc w:val="both"/>
       </w:pPr>
       <w:r>
@@ -2355,7 +2380,7 @@
     <w:p>
       <w:pPr>
         <w:keepNext w:val="0"/>
-        <w:spacing w:before="0" w:after="120" w:line="276" w:lineRule="auto"/>
+        <w:spacing w:before="0" w:after="80" w:line="276" w:lineRule="auto"/>
         <w:jc w:val="both"/>
       </w:pPr>
       <w:r>
@@ -2371,7 +2396,7 @@
     <w:p>
       <w:pPr>
         <w:keepNext w:val="0"/>
-        <w:spacing w:before="0" w:after="120" w:line="276" w:lineRule="auto"/>
+        <w:spacing w:before="0" w:after="80" w:line="276" w:lineRule="auto"/>
         <w:jc w:val="both"/>
       </w:pPr>
       <w:r>
@@ -2387,7 +2412,7 @@
     <w:p>
       <w:pPr>
         <w:keepNext w:val="0"/>
-        <w:spacing w:before="0" w:after="120" w:line="276" w:lineRule="auto"/>
+        <w:spacing w:before="0" w:after="80" w:line="276" w:lineRule="auto"/>
         <w:jc w:val="both"/>
       </w:pPr>
       <w:r>
@@ -2403,7 +2428,7 @@
     <w:p>
       <w:pPr>
         <w:keepNext w:val="0"/>
-        <w:spacing w:before="0" w:after="120" w:line="276" w:lineRule="auto"/>
+        <w:spacing w:before="0" w:after="80" w:line="276" w:lineRule="auto"/>
         <w:jc w:val="both"/>
       </w:pPr>
       <w:r>
@@ -2444,7 +2469,7 @@
     <w:p>
       <w:pPr>
         <w:keepNext w:val="0"/>
-        <w:spacing w:before="0" w:after="120" w:line="276" w:lineRule="auto"/>
+        <w:spacing w:before="0" w:after="80" w:line="276" w:lineRule="auto"/>
         <w:jc w:val="both"/>
       </w:pPr>
       <w:r>
@@ -2599,6 +2624,22 @@
           <w:sz w:val="20"/>
         </w:rPr>
         <w:t>[8] Milojevic-Dupont, N. și colab., „EUBUCCO v0.1: European building stock characteristics in a common and open database for 200+ million individual buildings”, Scientific Data, nr. 10, 2023.</w:t>
+      </w:r>
+    </w:p>
+    <w:p>
+      <w:pPr>
+        <w:keepNext w:val="0"/>
+        <w:spacing w:before="0" w:after="40" w:line="240" w:lineRule="auto"/>
+        <w:jc w:val="left"/>
+      </w:pPr>
+      <w:r>
+        <w:rPr>
+          <w:rFonts w:ascii="Times New Roman" w:hAnsi="Times New Roman" w:eastAsia="Times New Roman"/>
+          <w:b w:val="0"/>
+          <w:i w:val="0"/>
+          <w:sz w:val="20"/>
+        </w:rPr>
+        <w:t>[9] Echipa Umbra, Fișa de înscriere RoSEF, 21.09.2026; istoricul proiectului, github.com/Ieditzu/umbra, reviziile 2d33818 (24.10.2026) și d5a7eae (27.10.2026).</w:t>
       </w:r>
     </w:p>
     <w:sectPr>

</xml_diff>

<commit_message>
clarify research question and app features
</commit_message>
<xml_diff>
--- a/docs/paper/umbra-lucrare.docx
+++ b/docs/paper/umbra-lucrare.docx
@@ -363,7 +363,7 @@
           <w:i w:val="0"/>
           <w:sz w:val="24"/>
         </w:rPr>
-        <w:t>Calcularea înălțimii din umbră este cunoscută în teledetecție [4]. Am integrat-o într-un flux de măsurare cu telefonul. Întrebarea științifică este: cât de precis poate fi estimată înălțimea din umbră și cum alegem momentul măsurării? Evaluăm consistența GBA cu OSM, sensibilitatea la erori și fezabilitatea geometrică. Ipoteza unei precizii mai bune decât GBA la blocuri înalte rămâne de verificat cu referințe independente pe teren.</w:t>
+        <w:t>Calcularea înălțimii din umbră este cunoscută în teledetecție [4]. Am integrat-o într-un flux de măsurare cu telefonul. Întrebarea științifică este: cu ce eroare estimăm înălțimea clădirilor din umbre și când rămân vârfurile umbrelor neobstrucționate? Evaluăm consistența GBA cu OSM, sensibilitatea la erori și fezabilitatea geometrică. Ipoteza unei precizii mai bune decât GBA la blocuri înalte rămâne de verificat cu referințe independente pe teren.</w:t>
       </w:r>
     </w:p>
     <w:p>
@@ -404,7 +404,32 @@
           <w:i w:val="0"/>
           <w:sz w:val="24"/>
         </w:rPr>
-        <w:t xml:space="preserve"> Interfața este scrisă în TypeScript, cu React Native și Expo, pentru Android și iOS; motorul de calcul rulează pe un server Node.js. Datele OSM sunt pregătite automat pentru București și toate reședințele de județ și păstrate comprimat în proiect; analizele de mai jos folosesc instantaneul Constanței: 50.071 de noduri și 111.552 de muchii ale rețelei pietonale și 51.428 de contururi de clădiri, în coordonate metrice (UTM, EPSG:32635). Umbra arborilor este estimată separat, cu pondere redusă; lucrarea de față se ocupă numai de clădiri. Fiecare clădire are un interval de înălțime: o înălțime etichetată dă un interval îngust, iar numărul de etaje N dă intervalul 2,5·N – 3,5·N + 3 m. Un punct al traseului este considerat umbrit numai dacă raza Soarelui trece sub limita inferioară; între cele două limite rezultatul este „necunoscut”, iar clădirile fără înălțime nu susțin o clasificare sigură. Expunerea este evaluată la momentele parcurgerii. Căutarea compară un set limitat de candidați, fără garanția optimului global.</w:t>
+        <w:t xml:space="preserve"> Interfața este scrisă în TypeScript, cu React Native și Expo, pentru Android și iOS; motorul de calcul rulează pe un server Node.js. Catalogul publicat cuprinde 41 orașe cu date OSM pregătite, incluzând București și reședințele de județ. Datele se încarcă la cerere. Analizele de mai jos folosesc instantaneul Constanței: 50.071 de noduri și 111.552 de muchii ale rețelei pietonale și 51.428 de contururi de clădiri, în coordonate metrice (UTM, EPSG:32635). Umbra arborilor este estimată separat, cu pondere redusă; lucrarea de față se ocupă numai de clădiri. Fiecare clădire are un interval de înălțime: o înălțime etichetată dă un interval îngust, iar numărul de etaje N dă intervalul 2,5·N – 3,5·N + 3 m. Un punct al traseului este considerat umbrit numai dacă raza Soarelui trece sub limita inferioară; între cele două limite rezultatul este „necunoscut”, iar clădirile fără înălțime nu susțin o clasificare sigură. Expunerea este evaluată la momentele parcurgerii. Căutarea compară un set limitat de candidați, fără garanția optimului global.</w:t>
+      </w:r>
+    </w:p>
+    <w:p>
+      <w:pPr>
+        <w:keepNext w:val="0"/>
+        <w:spacing w:before="0" w:after="80" w:line="276" w:lineRule="auto"/>
+        <w:jc w:val="both"/>
+      </w:pPr>
+      <w:r>
+        <w:rPr>
+          <w:rFonts w:ascii="Times New Roman" w:hAnsi="Times New Roman" w:eastAsia="Times New Roman"/>
+          <w:b/>
+          <w:i w:val="0"/>
+          <w:sz w:val="24"/>
+        </w:rPr>
+        <w:t>Actualizări ale aplicației.</w:t>
+      </w:r>
+      <w:r>
+        <w:rPr>
+          <w:rFonts w:ascii="Times New Roman" w:hAnsi="Times New Roman" w:eastAsia="Times New Roman"/>
+          <w:b w:val="0"/>
+          <w:i w:val="0"/>
+          <w:sz w:val="24"/>
+        </w:rPr>
+        <w:t xml:space="preserve"> Copernicus Urban Atlas Building Block Height 2012 [9] completează 16.243 de înălțimi lipsă din OSM în Constanța, cu estimări marcate separat, fără a înlocui înălțimile OSM sau măsurătorile confirmate. Prognoza Open-Meteo [10] ajustează recomandarea dintre alternative în funcție de radiația directă estimată și durata mersului; în lipsa ei, comparația geometrică rămâne disponibilă. Aceste funcții extind aplicația; rezultatele numerice ale studiului rămân cele obținute pe datele OSM/GBA și simulările descrise mai jos.</w:t>
       </w:r>
     </w:p>
     <w:p>
@@ -2599,6 +2624,38 @@
           <w:sz w:val="20"/>
         </w:rPr>
         <w:t>[8] Milojevic-Dupont, N. și colab., „EUBUCCO v0.1: European building stock characteristics in a common and open database for 200+ million individual buildings”, Scientific Data, nr. 10, 2023.</w:t>
+      </w:r>
+    </w:p>
+    <w:p>
+      <w:pPr>
+        <w:keepNext w:val="0"/>
+        <w:spacing w:before="0" w:after="40" w:line="240" w:lineRule="auto"/>
+        <w:jc w:val="left"/>
+      </w:pPr>
+      <w:r>
+        <w:rPr>
+          <w:rFonts w:ascii="Times New Roman" w:hAnsi="Times New Roman" w:eastAsia="Times New Roman"/>
+          <w:b w:val="0"/>
+          <w:i w:val="0"/>
+          <w:sz w:val="20"/>
+        </w:rPr>
+        <w:t>[9] Copernicus Land Monitoring Service, Urban Atlas Building Block Height 2012, raster 10 m, land.copernicus.eu/en/products/urban-atlas/building-height-2012, accesat la 29.10.2026.</w:t>
+      </w:r>
+    </w:p>
+    <w:p>
+      <w:pPr>
+        <w:keepNext w:val="0"/>
+        <w:spacing w:before="0" w:after="40" w:line="240" w:lineRule="auto"/>
+        <w:jc w:val="left"/>
+      </w:pPr>
+      <w:r>
+        <w:rPr>
+          <w:rFonts w:ascii="Times New Roman" w:hAnsi="Times New Roman" w:eastAsia="Times New Roman"/>
+          <w:b w:val="0"/>
+          <w:i w:val="0"/>
+          <w:sz w:val="20"/>
+        </w:rPr>
+        <w:t>[10] Open-Meteo, Weather Forecast API, open-meteo.com/en/docs, variabile direct_radiation_instant și cloud_cover, accesat la 29.10.2026.</w:t>
       </w:r>
     </w:p>
     <w:sectPr>

</xml_diff>

<commit_message>
add solar panel estimate
</commit_message>
<xml_diff>
--- a/docs/paper/umbra-lucrare.docx
+++ b/docs/paper/umbra-lucrare.docx
@@ -430,6 +430,31 @@
           <w:sz w:val="24"/>
         </w:rPr>
         <w:t xml:space="preserve"> Copernicus Urban Atlas Building Block Height 2012 [9] completează 16.243 de înălțimi lipsă din OSM în Constanța, cu estimări marcate separat, fără a înlocui înălțimile OSM sau măsurătorile confirmate. Prognoza Open-Meteo [10] ajustează recomandarea dintre alternative în funcție de radiația directă estimată și durata mersului; în lipsa ei, comparația geometrică rămâne disponibilă. Aceste funcții extind aplicația; rezultatele numerice ale studiului rămân cele obținute pe datele OSM/GBA și simulările descrise mai jos.</w:t>
+      </w:r>
+    </w:p>
+    <w:p>
+      <w:pPr>
+        <w:keepNext w:val="0"/>
+        <w:spacing w:before="0" w:after="80" w:line="276" w:lineRule="auto"/>
+        <w:jc w:val="both"/>
+      </w:pPr>
+      <w:r>
+        <w:rPr>
+          <w:rFonts w:ascii="Times New Roman" w:hAnsi="Times New Roman" w:eastAsia="Times New Roman"/>
+          <w:b/>
+          <w:i w:val="0"/>
+          <w:sz w:val="24"/>
+        </w:rPr>
+        <w:t>Estimare fotovoltaică experimentală.</w:t>
+      </w:r>
+      <w:r>
+        <w:rPr>
+          <w:rFonts w:ascii="Times New Roman" w:hAnsi="Times New Roman" w:eastAsia="Times New Roman"/>
+          <w:b w:val="0"/>
+          <w:i w:val="0"/>
+          <w:sz w:val="24"/>
+        </w:rPr>
+        <w:t xml:space="preserve"> Utilizatorul alege o clădire, ziua, puterea nominală, înclinarea și orientarea panoului. Prognoza Open-Meteo [10] furnizează radiația orară pe plan înclinat, iar energia este aproximată prin puterea nominală, iradierea zilnică și un factor global de pierderi de 14%. Acesta este un model simplificat, nu o implementare completă PVWatts [11]; nu calculează umbrirea locală a acoperișului și nu a fost validat cu un panou real. PVGIS [12] și Google Solar API [13] oferă abordări de referință; rezultatele lor nu sunt reproduse aici.</w:t>
       </w:r>
     </w:p>
     <w:p>
@@ -2656,6 +2681,54 @@
           <w:sz w:val="20"/>
         </w:rPr>
         <w:t>[10] Open-Meteo, Weather Forecast API, open-meteo.com/en/docs, variabile direct_radiation_instant și cloud_cover, accesat la 29.10.2026.</w:t>
+      </w:r>
+    </w:p>
+    <w:p>
+      <w:pPr>
+        <w:keepNext w:val="0"/>
+        <w:spacing w:before="0" w:after="40" w:line="240" w:lineRule="auto"/>
+        <w:jc w:val="left"/>
+      </w:pPr>
+      <w:r>
+        <w:rPr>
+          <w:rFonts w:ascii="Times New Roman" w:hAnsi="Times New Roman" w:eastAsia="Times New Roman"/>
+          <w:b w:val="0"/>
+          <w:i w:val="0"/>
+          <w:sz w:val="20"/>
+        </w:rPr>
+        <w:t>[11] NREL, PVWatts Version 5 Manual, pvwatts.nrel.gov/downloads/pvwattsv5.pdf, accesat la 30.10.2026.</w:t>
+      </w:r>
+    </w:p>
+    <w:p>
+      <w:pPr>
+        <w:keepNext w:val="0"/>
+        <w:spacing w:before="0" w:after="40" w:line="240" w:lineRule="auto"/>
+        <w:jc w:val="left"/>
+      </w:pPr>
+      <w:r>
+        <w:rPr>
+          <w:rFonts w:ascii="Times New Roman" w:hAnsi="Times New Roman" w:eastAsia="Times New Roman"/>
+          <w:b w:val="0"/>
+          <w:i w:val="0"/>
+          <w:sz w:val="20"/>
+        </w:rPr>
+        <w:t>[12] Comisia Europeană, PVGIS, joint-research-centre.ec.europa.eu/photovoltaic-geographical-information-system-pvgis_en, accesat la 30.10.2026.</w:t>
+      </w:r>
+    </w:p>
+    <w:p>
+      <w:pPr>
+        <w:keepNext w:val="0"/>
+        <w:spacing w:before="0" w:after="40" w:line="240" w:lineRule="auto"/>
+        <w:jc w:val="left"/>
+      </w:pPr>
+      <w:r>
+        <w:rPr>
+          <w:rFonts w:ascii="Times New Roman" w:hAnsi="Times New Roman" w:eastAsia="Times New Roman"/>
+          <w:b w:val="0"/>
+          <w:i w:val="0"/>
+          <w:sz w:val="20"/>
+        </w:rPr>
+        <w:t>[13] Google, Solar API Building Insights, developers.google.com/maps/documentation/solar/building-insights, accesat la 30.10.2026.</w:t>
       </w:r>
     </w:p>
     <w:sectPr>

</xml_diff>

<commit_message>
add seasonal solar savings
</commit_message>
<xml_diff>
--- a/docs/paper/umbra-lucrare.docx
+++ b/docs/paper/umbra-lucrare.docx
@@ -454,7 +454,7 @@
           <w:i w:val="0"/>
           <w:sz w:val="24"/>
         </w:rPr>
-        <w:t xml:space="preserve"> Utilizatorul alege o clădire, ziua, puterea nominală, înclinarea și orientarea panoului. Prognoza Open-Meteo [10] furnizează radiația orară pe plan înclinat, iar energia este aproximată prin puterea nominală, iradierea zilnică și un factor global de pierderi de 14%. Acesta este un model simplificat, nu o implementare completă PVWatts [11]; nu calculează umbrirea locală a acoperișului și nu a fost validat cu un panou real. PVGIS [12] și Google Solar API [13] oferă abordări de referință; rezultatele lor nu sunt reproduse aici.</w:t>
+        <w:t xml:space="preserve"> Utilizatorul alege o clădire, ziua, puterea nominală, înclinarea și orientarea panoului. Open-Meteo [10] furnizează radiația orară pe plan înclinat: prognoza pentru zile apropiate sau media a trei zile istorice pentru sezon. Economia presupune autoconsum și prețul introdus. Energia este aproximată prin puterea nominală, iradierea zilnică și un factor global de pierderi de 14%. Acesta este un model simplificat, nu o implementare completă PVWatts [11]; nu calculează umbrirea locală a acoperișului și nu a fost validat cu un panou real. PVGIS [12] și Google Solar API [13] oferă abordări de referință; rezultatele lor nu sunt reproduse aici.</w:t>
       </w:r>
     </w:p>
     <w:p>
@@ -2680,7 +2680,7 @@
           <w:i w:val="0"/>
           <w:sz w:val="20"/>
         </w:rPr>
-        <w:t>[10] Open-Meteo, Weather Forecast API, open-meteo.com/en/docs, variabile direct_radiation_instant și cloud_cover, accesat la 29.10.2026.</w:t>
+        <w:t>[10] Open-Meteo, Weather Forecast API, open-meteo.com/en/docs; arhivă: open-meteo.com/en/docs/historical-weather-api, accesat la 30.10.2026.</w:t>
       </w:r>
     </w:p>
     <w:p>

</xml_diff>